<commit_message>
Regenerate V12 FINAL PDFs with retention fixes applied (102 beats)
Co-Authored-By: Claude Sonnet 4.6 <noreply@anthropic.com>
Claude-Session: https://claude.ai/code/session_01L4D3BJE5wxKGrRneu3Lana
</commit_message>
<xml_diff>
--- a/V12_final_SCRIPT.docx
+++ b/V12_final_SCRIPT.docx
@@ -835,6 +835,20 @@
         <w:t>Alex does.</w:t>
       </w:r>
     </w:p>
+    <w:p/>
+    <w:p>
+      <w:pPr>
+        <w:spacing w:before="280" w:after="80"/>
+      </w:pPr>
+      <w:r>
+        <w:rPr>
+          <w:b/>
+          <w:color w:val="B02A2A"/>
+          <w:sz w:val="22"/>
+        </w:rPr>
+        <w:t>— CTA —</w:t>
+      </w:r>
+    </w:p>
     <w:p>
       <w:pPr>
         <w:spacing w:before="20" w:after="20"/>
@@ -851,7 +865,7 @@
         <w:rPr>
           <w:sz w:val="22"/>
         </w:rPr>
-        <w:t>Over thirty years, the math does not favor Alex.</w:t>
+        <w:t>If your brain is running these programs right now — subscribe.</w:t>
       </w:r>
     </w:p>
     <w:p>
@@ -870,23 +884,10 @@
         <w:rPr>
           <w:sz w:val="22"/>
         </w:rPr>
-        <w:t>But here's what Baumeister also found — the part that changes how you actually set up the system.</w:t>
+        <w:t>Every week: one bias. How it works. Who exploits it. And what you can actually do about it.</w:t>
       </w:r>
     </w:p>
     <w:p/>
-    <w:p>
-      <w:pPr>
-        <w:spacing w:before="280" w:after="80"/>
-      </w:pPr>
-      <w:r>
-        <w:rPr>
-          <w:b/>
-          <w:color w:val="B02A2A"/>
-          <w:sz w:val="22"/>
-        </w:rPr>
-        <w:t>— THE DECISION —</w:t>
-      </w:r>
-    </w:p>
     <w:p>
       <w:pPr>
         <w:spacing w:before="20" w:after="20"/>
@@ -903,7 +904,7 @@
         <w:rPr>
           <w:sz w:val="22"/>
         </w:rPr>
-        <w:t>There is only one way to beat a system that runs automatically.</w:t>
+        <w:t>Over thirty years, the math does not favor Alex.</w:t>
       </w:r>
     </w:p>
     <w:p>
@@ -922,7 +923,21 @@
         <w:rPr>
           <w:sz w:val="22"/>
         </w:rPr>
-        <w:t>Build a counter-system that also runs automatically.</w:t>
+        <w:t>But here's what Baumeister also found — the part that changes how you actually set up the system.</w:t>
+      </w:r>
+    </w:p>
+    <w:p/>
+    <w:p>
+      <w:pPr>
+        <w:spacing w:before="280" w:after="80"/>
+      </w:pPr>
+      <w:r>
+        <w:rPr>
+          <w:b/>
+          <w:color w:val="B02A2A"/>
+          <w:sz w:val="22"/>
+        </w:rPr>
+        <w:t>— THE DECISION —</w:t>
       </w:r>
     </w:p>
     <w:p>
@@ -941,7 +956,7 @@
         <w:rPr>
           <w:sz w:val="22"/>
         </w:rPr>
-        <w:t>Alex set up a standing order.</w:t>
+        <w:t>There is only one way to beat a system that runs automatically.</w:t>
       </w:r>
     </w:p>
     <w:p>
@@ -960,7 +975,7 @@
         <w:rPr>
           <w:sz w:val="22"/>
         </w:rPr>
-        <w:t>Four hundred euros. Every payday. One minute before the salary notification arrives.</w:t>
+        <w:t>Build a counter-system that also runs automatically.</w:t>
       </w:r>
     </w:p>
     <w:p>
@@ -979,7 +994,7 @@
         <w:rPr>
           <w:sz w:val="22"/>
         </w:rPr>
-        <w:t>Before the Reward Trap fires its first question: what do I deserve?</w:t>
+        <w:t>Alex set up a standing order.</w:t>
       </w:r>
     </w:p>
     <w:p>
@@ -998,7 +1013,7 @@
         <w:rPr>
           <w:sz w:val="22"/>
         </w:rPr>
-        <w:t>Before Mental Accounting creates a label: this is mine, this is safe, this is earned.</w:t>
+        <w:t>Four hundred euros. Every payday. One minute before the salary notification arrives.</w:t>
       </w:r>
     </w:p>
     <w:p>
@@ -1017,7 +1032,7 @@
         <w:rPr>
           <w:sz w:val="22"/>
         </w:rPr>
-        <w:t>Before Present Bias whispers: Future Alex will take care of it.</w:t>
+        <w:t>Before the Reward Trap fires its first question: what do I deserve?</w:t>
       </w:r>
     </w:p>
     <w:p>
@@ -1036,7 +1051,7 @@
         <w:rPr>
           <w:sz w:val="22"/>
         </w:rPr>
-        <w:t>The Reward Trap fires the moment the salary hits. The standing order fires one minute earlier.</w:t>
+        <w:t>Before Mental Accounting creates a label: this is mine, this is safe, this is earned.</w:t>
       </w:r>
     </w:p>
     <w:p>
@@ -1055,7 +1070,7 @@
         <w:rPr>
           <w:sz w:val="22"/>
         </w:rPr>
-        <w:t>Mental Accounting assigns emotional labels to every euro Alex sees.</w:t>
+        <w:t>Before Present Bias whispers: Future Alex will take care of it.</w:t>
       </w:r>
     </w:p>
     <w:p>
@@ -1074,7 +1089,7 @@
         <w:rPr>
           <w:sz w:val="22"/>
         </w:rPr>
-        <w:t>The standing order moves four hundred euros into a category the Brain Villain is never shown.</w:t>
+        <w:t>The Reward Trap fires the moment the salary hits. The standing order fires one minute earlier.</w:t>
       </w:r>
     </w:p>
     <w:p>
@@ -1093,7 +1108,7 @@
         <w:rPr>
           <w:sz w:val="22"/>
         </w:rPr>
-        <w:t>Present Bias insists that Future Alex will be more responsible than Present Alex.</w:t>
+        <w:t>Mental Accounting assigns emotional labels to every euro Alex sees.</w:t>
       </w:r>
     </w:p>
     <w:p>
@@ -1112,7 +1127,7 @@
         <w:rPr>
           <w:sz w:val="22"/>
         </w:rPr>
-        <w:t>Past Alex already was — nine days before payday, when he was rested, calm, and the villain was quiet.</w:t>
+        <w:t>The standing order moves four hundred euros into a category the Brain Villain is never shown.</w:t>
       </w:r>
     </w:p>
     <w:p>
@@ -1131,7 +1146,7 @@
         <w:rPr>
           <w:sz w:val="22"/>
         </w:rPr>
-        <w:t>Alex didn't learn to say no to the Brain Villain.</w:t>
+        <w:t>Present Bias insists that Future Alex will be more responsible than Present Alex.</w:t>
       </w:r>
     </w:p>
     <w:p>
@@ -1150,7 +1165,7 @@
         <w:rPr>
           <w:sz w:val="22"/>
         </w:rPr>
-        <w:t>He cancelled the meeting.</w:t>
+        <w:t>Past Alex already was — nine days before payday, when he was rested, calm, and the villain was quiet.</w:t>
       </w:r>
     </w:p>
     <w:p>
@@ -1169,7 +1184,7 @@
         <w:rPr>
           <w:sz w:val="22"/>
         </w:rPr>
-        <w:t>The Brain Villain cannot argue with a decision it was never invited to attend.</w:t>
+        <w:t>Alex didn't learn to say no to the Brain Villain.</w:t>
       </w:r>
     </w:p>
     <w:p>
@@ -1188,7 +1203,7 @@
         <w:rPr>
           <w:sz w:val="22"/>
         </w:rPr>
-        <w:t>The money is simply not there.</w:t>
+        <w:t>He cancelled the meeting.</w:t>
       </w:r>
     </w:p>
     <w:p>
@@ -1207,7 +1222,7 @@
         <w:rPr>
           <w:sz w:val="22"/>
         </w:rPr>
-        <w:t>Not hidden. Not locked. Not off-limits.</w:t>
+        <w:t>The Brain Villain cannot argue with a decision it was never invited to attend.</w:t>
       </w:r>
     </w:p>
     <w:p>
@@ -1226,21 +1241,7 @@
         <w:rPr>
           <w:sz w:val="22"/>
         </w:rPr>
-        <w:t>Gone before the calculation begins.</w:t>
-      </w:r>
-    </w:p>
-    <w:p/>
-    <w:p>
-      <w:pPr>
-        <w:spacing w:before="280" w:after="80"/>
-      </w:pPr>
-      <w:r>
-        <w:rPr>
-          <w:b/>
-          <w:color w:val="B02A2A"/>
-          <w:sz w:val="22"/>
-        </w:rPr>
-        <w:t>— CTA —</w:t>
+        <w:t>The money is simply not there.</w:t>
       </w:r>
     </w:p>
     <w:p>
@@ -1259,7 +1260,7 @@
         <w:rPr>
           <w:sz w:val="22"/>
         </w:rPr>
-        <w:t>If your brain is running these programs right now — subscribe.</w:t>
+        <w:t>Not hidden. Not locked. Not off-limits.</w:t>
       </w:r>
     </w:p>
     <w:p>
@@ -1278,7 +1279,7 @@
         <w:rPr>
           <w:sz w:val="22"/>
         </w:rPr>
-        <w:t>Every week: one bias. How it works. Who exploits it. And what you can actually do about it.</w:t>
+        <w:t>Gone before the calculation begins.</w:t>
       </w:r>
     </w:p>
     <w:p/>
@@ -1909,7 +1910,7 @@
         <w:rPr>
           <w:sz w:val="22"/>
         </w:rPr>
-        <w:t>The Reward Trap fires on Friday. But the money is already somewhere else.</w:t>
+        <w:t>The programs are not broken.</w:t>
       </w:r>
     </w:p>
     <w:p>
@@ -1928,7 +1929,7 @@
         <w:rPr>
           <w:sz w:val="22"/>
         </w:rPr>
-        <w:t>Mental Accounting creates its emotional categories. But there's now one it will never see.</w:t>
+        <w:t>They are perfectly designed for an environment where saving made no survival sense.</w:t>
       </w:r>
     </w:p>
     <w:p>
@@ -1947,7 +1948,7 @@
         <w:rPr>
           <w:sz w:val="22"/>
         </w:rPr>
-        <w:t>Present Bias tells him Future Alex will be responsible.</w:t>
+        <w:t>You didn't store food in a world where tomorrow was never guaranteed.</w:t>
       </w:r>
     </w:p>
     <w:p>
@@ -1966,7 +1967,7 @@
         <w:rPr>
           <w:sz w:val="22"/>
         </w:rPr>
-        <w:t>And this time — he already was.</w:t>
+        <w:t>The Brain Villain was built for that world. Not this one.</w:t>
       </w:r>
     </w:p>
     <w:p>
@@ -1985,7 +1986,21 @@
         <w:rPr>
           <w:sz w:val="22"/>
         </w:rPr>
-        <w:t>The programs are not broken.</w:t>
+        <w:t>The standing order is the first system designed for the world he actually lives in.</w:t>
+      </w:r>
+    </w:p>
+    <w:p/>
+    <w:p>
+      <w:pPr>
+        <w:spacing w:before="280" w:after="80"/>
+      </w:pPr>
+      <w:r>
+        <w:rPr>
+          <w:b/>
+          <w:color w:val="B02A2A"/>
+          <w:sz w:val="22"/>
+        </w:rPr>
+        <w:t>— NEXT VIDEO TEASE —</w:t>
       </w:r>
     </w:p>
     <w:p>
@@ -2004,7 +2019,7 @@
         <w:rPr>
           <w:sz w:val="22"/>
         </w:rPr>
-        <w:t>They are perfectly designed for an environment where saving made no survival sense.</w:t>
+        <w:t>Next video: Alex gets a tax refund.</w:t>
       </w:r>
     </w:p>
     <w:p>
@@ -2023,7 +2038,7 @@
         <w:rPr>
           <w:sz w:val="22"/>
         </w:rPr>
-        <w:t>You didn't store food in a world where tomorrow was never guaranteed.</w:t>
+        <w:t>Eight hundred euros he wasn't expecting.</w:t>
       </w:r>
     </w:p>
     <w:p>
@@ -2042,7 +2057,7 @@
         <w:rPr>
           <w:sz w:val="22"/>
         </w:rPr>
-        <w:t>The Brain Villain was built for that world. Not this one.</w:t>
+        <w:t>His brain treats it completely differently from every euro he ever earned.</w:t>
       </w:r>
     </w:p>
     <w:p>
@@ -2061,7 +2076,7 @@
         <w:rPr>
           <w:sz w:val="22"/>
         </w:rPr>
-        <w:t>The standing order is the first system Alex has ever run</w:t>
+        <w:t>Same trap. Different label.</w:t>
       </w:r>
     </w:p>
     <w:p>
@@ -2080,21 +2095,7 @@
         <w:rPr>
           <w:sz w:val="22"/>
         </w:rPr>
-        <w:t>that was designed for the world he actually lives in.</w:t>
-      </w:r>
-    </w:p>
-    <w:p/>
-    <w:p>
-      <w:pPr>
-        <w:spacing w:before="280" w:after="80"/>
-      </w:pPr>
-      <w:r>
-        <w:rPr>
-          <w:b/>
-          <w:color w:val="B02A2A"/>
-          <w:sz w:val="22"/>
-        </w:rPr>
-        <w:t>— NEXT VIDEO TEASE —</w:t>
+        <w:t>The money disappears three times faster.</w:t>
       </w:r>
     </w:p>
     <w:p>
@@ -2113,101 +2114,6 @@
         <w:rPr>
           <w:sz w:val="22"/>
         </w:rPr>
-        <w:t>Next video: Alex gets a tax refund.</w:t>
-      </w:r>
-    </w:p>
-    <w:p>
-      <w:pPr>
-        <w:spacing w:before="20" w:after="20"/>
-      </w:pPr>
-      <w:r>
-        <w:rPr>
-          <w:b/>
-          <w:color w:val="888888"/>
-          <w:sz w:val="18"/>
-        </w:rPr>
-        <w:t xml:space="preserve">[103]  </w:t>
-      </w:r>
-      <w:r>
-        <w:rPr>
-          <w:sz w:val="22"/>
-        </w:rPr>
-        <w:t>Eight hundred euros he wasn't expecting.</w:t>
-      </w:r>
-    </w:p>
-    <w:p>
-      <w:pPr>
-        <w:spacing w:before="20" w:after="20"/>
-      </w:pPr>
-      <w:r>
-        <w:rPr>
-          <w:b/>
-          <w:color w:val="888888"/>
-          <w:sz w:val="18"/>
-        </w:rPr>
-        <w:t xml:space="preserve">[104]  </w:t>
-      </w:r>
-      <w:r>
-        <w:rPr>
-          <w:sz w:val="22"/>
-        </w:rPr>
-        <w:t>His brain treats it completely differently from every euro he ever earned.</w:t>
-      </w:r>
-    </w:p>
-    <w:p>
-      <w:pPr>
-        <w:spacing w:before="20" w:after="20"/>
-      </w:pPr>
-      <w:r>
-        <w:rPr>
-          <w:b/>
-          <w:color w:val="888888"/>
-          <w:sz w:val="18"/>
-        </w:rPr>
-        <w:t xml:space="preserve">[105]  </w:t>
-      </w:r>
-      <w:r>
-        <w:rPr>
-          <w:sz w:val="22"/>
-        </w:rPr>
-        <w:t>Same trap. Different label.</w:t>
-      </w:r>
-    </w:p>
-    <w:p>
-      <w:pPr>
-        <w:spacing w:before="20" w:after="20"/>
-      </w:pPr>
-      <w:r>
-        <w:rPr>
-          <w:b/>
-          <w:color w:val="888888"/>
-          <w:sz w:val="18"/>
-        </w:rPr>
-        <w:t xml:space="preserve">[106]  </w:t>
-      </w:r>
-      <w:r>
-        <w:rPr>
-          <w:sz w:val="22"/>
-        </w:rPr>
-        <w:t>The money disappears three times faster.</w:t>
-      </w:r>
-    </w:p>
-    <w:p>
-      <w:pPr>
-        <w:spacing w:before="20" w:after="20"/>
-      </w:pPr>
-      <w:r>
-        <w:rPr>
-          <w:b/>
-          <w:color w:val="888888"/>
-          <w:sz w:val="18"/>
-        </w:rPr>
-        <w:t xml:space="preserve">[107]  </w:t>
-      </w:r>
-      <w:r>
-        <w:rPr>
-          <w:sz w:val="22"/>
-        </w:rPr>
         <w:t>The reason is the one nobody expects.</w:t>
       </w:r>
     </w:p>
@@ -2221,7 +2127,7 @@
           <w:color w:val="666666"/>
           <w:sz w:val="18"/>
         </w:rPr>
-        <w:t>TOTAL: 107 beats · ~1071 words · ~8 min</w:t>
+        <w:t>TOTAL: 102 beats · ~1022 words · ~7 min</w:t>
       </w:r>
     </w:p>
     <w:sectPr>

</xml_diff>